<commit_message>
Week 7 agenda changes
</commit_message>
<xml_diff>
--- a/Documentation/Week 7/Meeting_Agenda_Week_7.docx
+++ b/Documentation/Week 7/Meeting_Agenda_Week_7.docx
@@ -554,7 +554,25 @@
                 <w:sz w:val="24"/>
                 <w:szCs w:val="24"/>
               </w:rPr>
-              <w:t xml:space="preserve">Ensure simulation is linked to mujoco </w:t>
+              <w:t xml:space="preserve">Ensure simulation is linked to </w:t>
+            </w:r>
+            <w:proofErr w:type="spellStart"/>
+            <w:r>
+              <w:rPr>
+                <w:rFonts w:ascii="Times New Roman" w:hAnsi="Times New Roman" w:cs="Times New Roman"/>
+                <w:sz w:val="24"/>
+                <w:szCs w:val="24"/>
+              </w:rPr>
+              <w:t>mujoco</w:t>
+            </w:r>
+            <w:proofErr w:type="spellEnd"/>
+            <w:r>
+              <w:rPr>
+                <w:rFonts w:ascii="Times New Roman" w:hAnsi="Times New Roman" w:cs="Times New Roman"/>
+                <w:sz w:val="24"/>
+                <w:szCs w:val="24"/>
+              </w:rPr>
+              <w:t xml:space="preserve"> </w:t>
             </w:r>
           </w:p>
         </w:tc>
@@ -722,8 +740,18 @@
                 <w:sz w:val="24"/>
                 <w:szCs w:val="24"/>
               </w:rPr>
-              <w:t>link to mujoco</w:t>
-            </w:r>
+              <w:t xml:space="preserve">link to </w:t>
+            </w:r>
+            <w:proofErr w:type="spellStart"/>
+            <w:r>
+              <w:rPr>
+                <w:rFonts w:ascii="Times New Roman" w:hAnsi="Times New Roman" w:cs="Times New Roman"/>
+                <w:sz w:val="24"/>
+                <w:szCs w:val="24"/>
+              </w:rPr>
+              <w:t>mujoco</w:t>
+            </w:r>
+            <w:proofErr w:type="spellEnd"/>
           </w:p>
           <w:p>
             <w:pPr>
@@ -745,7 +773,25 @@
                 <w:sz w:val="24"/>
                 <w:szCs w:val="24"/>
               </w:rPr>
-              <w:t>Link to separate mujoco simulations</w:t>
+              <w:t xml:space="preserve">Link to separate </w:t>
+            </w:r>
+            <w:proofErr w:type="spellStart"/>
+            <w:r>
+              <w:rPr>
+                <w:rFonts w:ascii="Times New Roman" w:hAnsi="Times New Roman" w:cs="Times New Roman"/>
+                <w:sz w:val="24"/>
+                <w:szCs w:val="24"/>
+              </w:rPr>
+              <w:t>mujoco</w:t>
+            </w:r>
+            <w:proofErr w:type="spellEnd"/>
+            <w:r>
+              <w:rPr>
+                <w:rFonts w:ascii="Times New Roman" w:hAnsi="Times New Roman" w:cs="Times New Roman"/>
+                <w:sz w:val="24"/>
+                <w:szCs w:val="24"/>
+              </w:rPr>
+              <w:t xml:space="preserve"> simulations</w:t>
             </w:r>
           </w:p>
         </w:tc>
@@ -764,6 +810,14 @@
                 <w:szCs w:val="24"/>
               </w:rPr>
             </w:pPr>
+            <w:r>
+              <w:rPr>
+                <w:rFonts w:ascii="Times New Roman" w:hAnsi="Times New Roman" w:cs="Times New Roman"/>
+                <w:sz w:val="24"/>
+                <w:szCs w:val="24"/>
+              </w:rPr>
+              <w:t xml:space="preserve">Sprint 2 </w:t>
+            </w:r>
             <w:r>
               <w:rPr>
                 <w:rFonts w:ascii="Times New Roman" w:hAnsi="Times New Roman" w:cs="Times New Roman"/>

</xml_diff>

<commit_message>
update: updated week 7 deliverables
</commit_message>
<xml_diff>
--- a/Documentation/Week 7/Meeting_Agenda_Week_7.docx
+++ b/Documentation/Week 7/Meeting_Agenda_Week_7.docx
@@ -235,13 +235,13 @@
         <w:tblLook w:val="04A0" w:firstRow="1" w:lastRow="0" w:firstColumn="1" w:lastColumn="0" w:noHBand="0" w:noVBand="1"/>
       </w:tblPr>
       <w:tblGrid>
-        <w:gridCol w:w="1555"/>
-        <w:gridCol w:w="7795"/>
+        <w:gridCol w:w="1980"/>
+        <w:gridCol w:w="7370"/>
       </w:tblGrid>
       <w:tr>
         <w:tc>
           <w:tcPr>
-            <w:tcW w:w="1555" w:type="dxa"/>
+            <w:tcW w:w="1980" w:type="dxa"/>
             <w:shd w:val="clear" w:color="auto" w:fill="D5DCE4" w:themeFill="text2" w:themeFillTint="33"/>
           </w:tcPr>
           <w:p>
@@ -265,7 +265,7 @@
         </w:tc>
         <w:tc>
           <w:tcPr>
-            <w:tcW w:w="7795" w:type="dxa"/>
+            <w:tcW w:w="7370" w:type="dxa"/>
             <w:shd w:val="clear" w:color="auto" w:fill="D5DCE4" w:themeFill="text2" w:themeFillTint="33"/>
           </w:tcPr>
           <w:p>
@@ -291,7 +291,7 @@
       <w:tr>
         <w:tc>
           <w:tcPr>
-            <w:tcW w:w="1555" w:type="dxa"/>
+            <w:tcW w:w="1980" w:type="dxa"/>
           </w:tcPr>
           <w:p>
             <w:pPr>
@@ -314,7 +314,7 @@
         </w:tc>
         <w:tc>
           <w:tcPr>
-            <w:tcW w:w="7795" w:type="dxa"/>
+            <w:tcW w:w="7370" w:type="dxa"/>
           </w:tcPr>
           <w:p>
             <w:pPr>
@@ -439,7 +439,7 @@
       <w:tr>
         <w:tc>
           <w:tcPr>
-            <w:tcW w:w="1555" w:type="dxa"/>
+            <w:tcW w:w="1980" w:type="dxa"/>
           </w:tcPr>
           <w:p>
             <w:pPr>
@@ -462,7 +462,7 @@
         </w:tc>
         <w:tc>
           <w:tcPr>
-            <w:tcW w:w="7795" w:type="dxa"/>
+            <w:tcW w:w="7370" w:type="dxa"/>
           </w:tcPr>
           <w:p>
             <w:pPr>
@@ -500,7 +500,25 @@
                 <w:sz w:val="24"/>
                 <w:szCs w:val="24"/>
               </w:rPr>
-              <w:t>both sub-teams progress</w:t>
+              <w:t>both sub-</w:t>
+            </w:r>
+            <w:proofErr w:type="gramStart"/>
+            <w:r>
+              <w:rPr>
+                <w:rFonts w:ascii="Times New Roman" w:hAnsi="Times New Roman" w:cs="Times New Roman"/>
+                <w:sz w:val="24"/>
+                <w:szCs w:val="24"/>
+              </w:rPr>
+              <w:t>teams</w:t>
+            </w:r>
+            <w:proofErr w:type="gramEnd"/>
+            <w:r>
+              <w:rPr>
+                <w:rFonts w:ascii="Times New Roman" w:hAnsi="Times New Roman" w:cs="Times New Roman"/>
+                <w:sz w:val="24"/>
+                <w:szCs w:val="24"/>
+              </w:rPr>
+              <w:t xml:space="preserve"> progress</w:t>
             </w:r>
           </w:p>
           <w:p>
@@ -580,7 +598,7 @@
       <w:tr>
         <w:tc>
           <w:tcPr>
-            <w:tcW w:w="1555" w:type="dxa"/>
+            <w:tcW w:w="1980" w:type="dxa"/>
           </w:tcPr>
           <w:p>
             <w:pPr>
@@ -597,13 +615,13 @@
                 <w:sz w:val="24"/>
                 <w:szCs w:val="24"/>
               </w:rPr>
-              <w:t>Client</w:t>
+              <w:t>Mentor/auditor</w:t>
             </w:r>
           </w:p>
         </w:tc>
         <w:tc>
           <w:tcPr>
-            <w:tcW w:w="7795" w:type="dxa"/>
+            <w:tcW w:w="7370" w:type="dxa"/>
           </w:tcPr>
           <w:p>
             <w:pPr>
@@ -625,7 +643,7 @@
                 <w:sz w:val="24"/>
                 <w:szCs w:val="24"/>
               </w:rPr>
-              <w:t>Discuss what we are going to demo/ask in client meeting</w:t>
+              <w:t>Record any questions we have for them</w:t>
             </w:r>
           </w:p>
         </w:tc>
@@ -633,7 +651,7 @@
       <w:tr>
         <w:tc>
           <w:tcPr>
-            <w:tcW w:w="1555" w:type="dxa"/>
+            <w:tcW w:w="1980" w:type="dxa"/>
           </w:tcPr>
           <w:p>
             <w:pPr>
@@ -656,7 +674,7 @@
         </w:tc>
         <w:tc>
           <w:tcPr>
-            <w:tcW w:w="7795" w:type="dxa"/>
+            <w:tcW w:w="7370" w:type="dxa"/>
           </w:tcPr>
           <w:p>
             <w:pPr>
@@ -799,7 +817,7 @@
       <w:tr>
         <w:tc>
           <w:tcPr>
-            <w:tcW w:w="1555" w:type="dxa"/>
+            <w:tcW w:w="1980" w:type="dxa"/>
           </w:tcPr>
           <w:p>
             <w:pPr>
@@ -830,7 +848,7 @@
         </w:tc>
         <w:tc>
           <w:tcPr>
-            <w:tcW w:w="7795" w:type="dxa"/>
+            <w:tcW w:w="7370" w:type="dxa"/>
           </w:tcPr>
           <w:p>
             <w:pPr>
@@ -860,7 +878,7 @@
       <w:tr>
         <w:tc>
           <w:tcPr>
-            <w:tcW w:w="1555" w:type="dxa"/>
+            <w:tcW w:w="1980" w:type="dxa"/>
           </w:tcPr>
           <w:p>
             <w:pPr>
@@ -883,7 +901,7 @@
         </w:tc>
         <w:tc>
           <w:tcPr>
-            <w:tcW w:w="7795" w:type="dxa"/>
+            <w:tcW w:w="7370" w:type="dxa"/>
           </w:tcPr>
           <w:p>
             <w:pPr>

</xml_diff>